<commit_message>
Add 17 new JDs and statutory positions tab
</commit_message>
<xml_diff>
--- a/jds/Glencore.docx
+++ b/jds/Glencore.docx
@@ -3,93 +3,79 @@
 <w:document xmlns:wpc="http://schemas.microsoft.com/office/word/2010/wordprocessingCanvas" xmlns:cx="http://schemas.microsoft.com/office/drawing/2014/chartex" xmlns:cx1="http://schemas.microsoft.com/office/drawing/2015/9/8/chartex" xmlns:cx2="http://schemas.microsoft.com/office/drawing/2015/10/21/chartex" xmlns:cx3="http://schemas.microsoft.com/office/drawing/2016/5/9/chartex" xmlns:cx4="http://schemas.microsoft.com/office/drawing/2016/5/10/chartex" xmlns:cx5="http://schemas.microsoft.com/office/drawing/2016/5/11/chartex" xmlns:cx6="http://schemas.microsoft.com/office/drawing/2016/5/12/chartex" xmlns:cx7="http://schemas.microsoft.com/office/drawing/2016/5/13/chartex" xmlns:cx8="http://schemas.microsoft.com/office/drawing/2016/5/14/chartex" xmlns:mc="http://schemas.openxmlformats.org/markup-compatibility/2006" xmlns:aink="http://schemas.microsoft.com/office/drawing/2016/ink" xmlns:am3d="http://schemas.microsoft.com/office/drawing/2017/model3d" xmlns:o="urn:schemas-microsoft-com:office:office" xmlns:oel="http://schemas.microsoft.com/office/2019/extlst" xmlns:r="http://schemas.openxmlformats.org/officeDocument/2006/relationships" xmlns:m="http://schemas.openxmlformats.org/officeDocument/2006/math" xmlns:v="urn:schemas-microsoft-com:vml" xmlns:wp14="http://schemas.microsoft.com/office/word/2010/wordprocessingDrawing" xmlns:wp="http://schemas.openxmlformats.org/drawingml/2006/wordprocessingDrawing" xmlns:w10="urn:schemas-microsoft-com:office:word" xmlns:w="http://schemas.openxmlformats.org/wordprocessingml/2006/main" xmlns:w14="http://schemas.microsoft.com/office/word/2010/wordml" xmlns:w15="http://schemas.microsoft.com/office/word/2012/wordml" xmlns:w16cex="http://schemas.microsoft.com/office/word/2018/wordml/cex" xmlns:w16cid="http://schemas.microsoft.com/office/word/2016/wordml/cid" xmlns:w16="http://schemas.microsoft.com/office/word/2018/wordml" xmlns:w16du="http://schemas.microsoft.com/office/word/2023/wordml/word16du" xmlns:w16sdtdh="http://schemas.microsoft.com/office/word/2020/wordml/sdtdatahash" xmlns:w16sdtfl="http://schemas.microsoft.com/office/word/2024/wordml/sdtformatlock" xmlns:w16se="http://schemas.microsoft.com/office/word/2015/wordml/symex" xmlns:wpg="http://schemas.microsoft.com/office/word/2010/wordprocessingGroup" xmlns:wpi="http://schemas.microsoft.com/office/word/2010/wordprocessingInk" xmlns:wne="http://schemas.microsoft.com/office/word/2006/wordml" xmlns:wps="http://schemas.microsoft.com/office/word/2010/wordprocessingShape" mc:Ignorable="w14 w15 w16se w16cid w16 w16cex w16sdtdh w16sdtfl w16du wp14">
   <w:body>
     <w:p>
+      <w:r>
+        <w:drawing>
+          <wp:inline distT="0" distB="0" distL="0" distR="0" wp14:anchorId="3829C035" wp14:editId="413DD881">
+            <wp:extent cx="1714500" cy="304800"/>
+            <wp:effectExtent l="0" t="0" r="0" b="0"/>
+            <wp:docPr id="270612608" name="Picture 2"/>
+            <wp:cNvGraphicFramePr>
+              <a:graphicFrameLocks xmlns:a="http://schemas.openxmlformats.org/drawingml/2006/main" noChangeAspect="1"/>
+            </wp:cNvGraphicFramePr>
+            <a:graphic xmlns:a="http://schemas.openxmlformats.org/drawingml/2006/main">
+              <a:graphicData uri="http://schemas.openxmlformats.org/drawingml/2006/picture">
+                <pic:pic xmlns:pic="http://schemas.openxmlformats.org/drawingml/2006/picture">
+                  <pic:nvPicPr>
+                    <pic:cNvPr id="0" name="Picture 6"/>
+                    <pic:cNvPicPr>
+                      <a:picLocks noChangeAspect="1" noChangeArrowheads="1"/>
+                    </pic:cNvPicPr>
+                  </pic:nvPicPr>
+                  <pic:blipFill>
+                    <a:blip r:embed="rId5">
+                      <a:extLst>
+                        <a:ext uri="{28A0092B-C50C-407E-A947-70E740481C1C}">
+                          <a14:useLocalDpi xmlns:a14="http://schemas.microsoft.com/office/drawing/2010/main" val="0"/>
+                        </a:ext>
+                      </a:extLst>
+                    </a:blip>
+                    <a:srcRect/>
+                    <a:stretch>
+                      <a:fillRect/>
+                    </a:stretch>
+                  </pic:blipFill>
+                  <pic:spPr bwMode="auto">
+                    <a:xfrm>
+                      <a:off x="0" y="0"/>
+                      <a:ext cx="1714500" cy="304800"/>
+                    </a:xfrm>
+                    <a:prstGeom prst="rect">
+                      <a:avLst/>
+                    </a:prstGeom>
+                    <a:noFill/>
+                    <a:ln>
+                      <a:noFill/>
+                    </a:ln>
+                  </pic:spPr>
+                </pic:pic>
+              </a:graphicData>
+            </a:graphic>
+          </wp:inline>
+        </w:drawing>
+      </w:r>
+    </w:p>
+    <w:p>
       <w:pPr>
         <w:rPr>
           <w:b/>
           <w:bCs/>
         </w:rPr>
       </w:pPr>
-      <w:r>
-        <w:rPr>
-          <w:b/>
-          <w:bCs/>
-        </w:rPr>
-        <w:fldChar w:fldCharType="begin"/>
-      </w:r>
-      <w:r>
-        <w:rPr>
-          <w:b/>
-          <w:bCs/>
-        </w:rPr>
-        <w:instrText>HYPERLINK "https://www.seek.com.au/job/90641805?ref=search-standalone&amp;type=standard&amp;origin=jobTitle" \l "sol=902883afb2d9264c2842f1dc4bf81fd9af787b0d" \t "_blank"</w:instrText>
-      </w:r>
-      <w:r>
-        <w:rPr>
-          <w:b/>
-          <w:bCs/>
-        </w:rPr>
-      </w:r>
-      <w:r>
-        <w:rPr>
-          <w:b/>
-          <w:bCs/>
-        </w:rPr>
-        <w:fldChar w:fldCharType="separate"/>
-      </w:r>
-      <w:r>
-        <w:rPr>
-          <w:rStyle w:val="Hyperlink"/>
-          <w:b/>
-          <w:bCs/>
-        </w:rPr>
-        <w:t>Supervisor - Primary Smelting</w:t>
-      </w:r>
-      <w:r>
-        <w:fldChar w:fldCharType="end"/>
-      </w:r>
-    </w:p>
-    <w:p>
-      <w:r>
-        <w:t>Glencore </w:t>
-      </w:r>
-    </w:p>
-    <w:p>
-      <w:r>
-        <w:t>3.3</w:t>
-      </w:r>
-      <w:hyperlink r:id="rId5" w:tgtFrame="_self" w:history="1">
+      <w:hyperlink r:id="rId6" w:anchor="sol=5ace4ac85c9c82ef8a0a4b0627e3254d024a5676" w:tgtFrame="_blank" w:history="1">
         <w:r>
           <w:rPr>
             <w:rStyle w:val="Hyperlink"/>
+            <w:b/>
+            <w:bCs/>
           </w:rPr>
-          <w:t xml:space="preserve">264 </w:t>
-        </w:r>
-        <w:proofErr w:type="spellStart"/>
-        <w:r>
-          <w:rPr>
-            <w:rStyle w:val="Hyperlink"/>
-          </w:rPr>
-          <w:t>reviews</w:t>
+          <w:t>Production Supervisor</w:t>
         </w:r>
       </w:hyperlink>
-      <w:r>
-        <w:t>·</w:t>
-      </w:r>
-      <w:hyperlink r:id="rId6" w:tgtFrame="_self" w:history="1">
-        <w:r>
-          <w:rPr>
-            <w:rStyle w:val="Hyperlink"/>
-          </w:rPr>
-          <w:t>View</w:t>
-        </w:r>
-        <w:proofErr w:type="spellEnd"/>
-        <w:r>
-          <w:rPr>
-            <w:rStyle w:val="Hyperlink"/>
-          </w:rPr>
-          <w:t xml:space="preserve"> all jobs</w:t>
-        </w:r>
-      </w:hyperlink>
+    </w:p>
+    <w:p>
+      <w:r>
+        <w:t>Glencore Coal </w:t>
+      </w:r>
     </w:p>
     <w:p>
       <w:hyperlink r:id="rId7" w:tgtFrame="_self" w:history="1">
@@ -97,7 +83,7 @@
           <w:rPr>
             <w:rStyle w:val="Hyperlink"/>
           </w:rPr>
-          <w:t>Mount Isa, Western QLD</w:t>
+          <w:t>Springsure, Gladstone &amp; Central QLD</w:t>
         </w:r>
       </w:hyperlink>
     </w:p>
@@ -123,12 +109,12 @@
     </w:p>
     <w:p>
       <w:r>
-        <w:t>Add expected salary to your profile for insights</w:t>
-      </w:r>
-    </w:p>
-    <w:p>
-      <w:r>
-        <w:t>Posted 5h ago</w:t>
+        <w:t>Competitive salary package and lifestyle benefits</w:t>
+      </w:r>
+    </w:p>
+    <w:p>
+      <w:r>
+        <w:t>Posted 4d ago</w:t>
       </w:r>
     </w:p>
     <w:p>
@@ -137,132 +123,235 @@
           <w:b/>
           <w:bCs/>
         </w:rPr>
-        <w:t>Supervisor – Primary Smelting  </w:t>
-      </w:r>
-      <w:r>
-        <w:br/>
-      </w:r>
+        <w:t>Rolleston Open Cut is a 16Mtpa thermal coal mine located in the southern Bowen Basin in Central Queensland.  With a long life of mine and low operating costs, the mine has a bright outlook.  Since 2005, we have grown to become one of the largest surface mines in Australia, whilst continuing to foster a culture underpinned by safety, achievement, flexibility and teamwork to improve the skills of each and every person on the mine site every day.  We are a hands-on team who all work together to meet our objectives.  No job or day is the same with us, and we never miss an opportunity to share, learn and improve.  </w:t>
+      </w:r>
+    </w:p>
+    <w:p>
       <w:r>
         <w:rPr>
           <w:b/>
           <w:bCs/>
         </w:rPr>
-        <w:t>QLD Metallurgical Operations, Copper Smelter Primary Operations</w:t>
-      </w:r>
-      <w:r>
-        <w:br/>
-      </w:r>
+        <w:t>Glencore is committed to providing an environment that adheres to the Respect at Work Legislation.</w:t>
+      </w:r>
+    </w:p>
+    <w:p>
       <w:r>
         <w:rPr>
           <w:b/>
           <w:bCs/>
         </w:rPr>
-        <w:t>Mount Isa, Queensland, Australia</w:t>
+        <w:t>Job Description</w:t>
       </w:r>
       <w:r>
         <w:br/>
       </w:r>
+    </w:p>
+    <w:p>
       <w:r>
         <w:rPr>
           <w:b/>
           <w:bCs/>
         </w:rPr>
-        <w:t>Ref. No. 6105</w:t>
-      </w:r>
+        <w:t>About the Role</w:t>
+      </w:r>
+    </w:p>
+    <w:p>
+      <w:r>
+        <w:t>An exciting opportunity has become available for an experienced Production Supervisor to join our dynamic and successful team.  As a valued member of the Minning team and reporting directly to the Blast &amp; Mine Services Superintendent, you will be responsible for:</w:t>
+      </w:r>
+      <w:r>
+        <w:br/>
+        <w:t> </w:t>
+      </w:r>
+    </w:p>
+    <w:p>
+      <w:pPr>
+        <w:numPr>
+          <w:ilvl w:val="0"/>
+          <w:numId w:val="1"/>
+        </w:numPr>
+      </w:pPr>
+      <w:r>
+        <w:t>Providing direct supervision of employees and sub-contractors working within the area of responsibility and allocating day-to-day work priorities.</w:t>
+      </w:r>
+    </w:p>
+    <w:p>
+      <w:pPr>
+        <w:numPr>
+          <w:ilvl w:val="0"/>
+          <w:numId w:val="1"/>
+        </w:numPr>
+      </w:pPr>
+      <w:r>
+        <w:t>Liaise with key personnel and share ideas for overall improvement outcomes</w:t>
+      </w:r>
+    </w:p>
+    <w:p>
+      <w:pPr>
+        <w:numPr>
+          <w:ilvl w:val="0"/>
+          <w:numId w:val="1"/>
+        </w:numPr>
+      </w:pPr>
+      <w:r>
+        <w:t>Developing and maintaining a cohesive team.</w:t>
+      </w:r>
+    </w:p>
+    <w:p>
+      <w:pPr>
+        <w:numPr>
+          <w:ilvl w:val="0"/>
+          <w:numId w:val="1"/>
+        </w:numPr>
+      </w:pPr>
+      <w:r>
+        <w:t>Promoting continuous improvement</w:t>
+      </w:r>
+    </w:p>
+    <w:p>
+      <w:pPr>
+        <w:numPr>
+          <w:ilvl w:val="0"/>
+          <w:numId w:val="1"/>
+        </w:numPr>
+      </w:pPr>
+      <w:r>
+        <w:t>Engagement with Technical Services and Maintenance teams to make sure plans are accurate.</w:t>
+      </w:r>
+    </w:p>
+    <w:p>
+      <w:pPr>
+        <w:numPr>
+          <w:ilvl w:val="0"/>
+          <w:numId w:val="1"/>
+        </w:numPr>
+      </w:pPr>
+      <w:r>
+        <w:t>Driving continuous improvement opportunities through innovation and collaboration.</w:t>
+      </w:r>
+    </w:p>
+    <w:p>
+      <w:pPr>
+        <w:numPr>
+          <w:ilvl w:val="0"/>
+          <w:numId w:val="1"/>
+        </w:numPr>
+      </w:pPr>
+      <w:r>
+        <w:t>Identify, assess and control workplace hazards</w:t>
+      </w:r>
+    </w:p>
+    <w:p>
       <w:r>
         <w:rPr>
           <w:b/>
           <w:bCs/>
         </w:rPr>
-        <w:br/>
-      </w:r>
-      <w:r>
-        <w:br/>
-        <w:t>A vacancy currently exists for the role of Supervisor – Primary Operations Crew D within the Copper Smelter. Reporting to the Superintendent – Primary Smelting Operations, you will be required to effectively coordinate and control the shift activities of the Copper Smelter operational assets, ensuring agreed targets are achieved in a manner consistent with our values whilst engaging and developing a team of front-line operations personnel. This is a residential position in Mount Isa, working a continuous shift roster – 2 days, 2 nights, 4 days off. Occasionally you may be required to be flexible in terms of work times and rosters.  </w:t>
-      </w:r>
-      <w:r>
-        <w:br/>
-      </w:r>
-      <w:r>
-        <w:br/>
+        <w:t>About you </w:t>
+      </w:r>
+    </w:p>
+    <w:p>
+      <w:r>
+        <w:t>To be successful in this role, you will have:</w:t>
+      </w:r>
+    </w:p>
+    <w:p>
+      <w:pPr>
+        <w:numPr>
+          <w:ilvl w:val="0"/>
+          <w:numId w:val="2"/>
+        </w:numPr>
+      </w:pPr>
+      <w:r>
+        <w:t>Appropriate supervisory experience for the role;</w:t>
+      </w:r>
+    </w:p>
+    <w:p>
+      <w:pPr>
+        <w:numPr>
+          <w:ilvl w:val="0"/>
+          <w:numId w:val="2"/>
+        </w:numPr>
+      </w:pPr>
+      <w:r>
+        <w:t>Standout </w:t>
       </w:r>
       <w:r>
         <w:rPr>
           <w:b/>
           <w:bCs/>
         </w:rPr>
-        <w:t>This challenging and rewarding role will require you to:</w:t>
-      </w:r>
-    </w:p>
-    <w:p>
-      <w:pPr>
-        <w:numPr>
-          <w:ilvl w:val="0"/>
-          <w:numId w:val="1"/>
-        </w:numPr>
-      </w:pPr>
-      <w:r>
-        <w:t xml:space="preserve">Coordinate and manage operational safety, production and risk in a large and complex footprint including assets associated with Concentrate Feed Preparation as well as the Copper </w:t>
-      </w:r>
-      <w:proofErr w:type="spellStart"/>
-      <w:r>
-        <w:t>IsaSmelt</w:t>
-      </w:r>
-      <w:proofErr w:type="spellEnd"/>
-      <w:r>
-        <w:t xml:space="preserve"> and Rotary Holding Furnaces</w:t>
-      </w:r>
-    </w:p>
-    <w:p>
-      <w:pPr>
-        <w:numPr>
-          <w:ilvl w:val="0"/>
-          <w:numId w:val="1"/>
-        </w:numPr>
-      </w:pPr>
-      <w:r>
-        <w:t xml:space="preserve">Build and promote </w:t>
-      </w:r>
-      <w:proofErr w:type="gramStart"/>
-      <w:r>
-        <w:t>team work</w:t>
-      </w:r>
-      <w:proofErr w:type="gramEnd"/>
-      <w:r>
-        <w:t xml:space="preserve"> within your team, across the wider Smelter department and Queensland Metals business</w:t>
-      </w:r>
-    </w:p>
-    <w:p>
-      <w:pPr>
-        <w:numPr>
-          <w:ilvl w:val="0"/>
-          <w:numId w:val="1"/>
-        </w:numPr>
-      </w:pPr>
-      <w:r>
-        <w:t>Development of skills and capability necessary for you and your team to recognise and control risks to drive a Safe, positive and productive culture</w:t>
-      </w:r>
-    </w:p>
-    <w:p>
-      <w:pPr>
-        <w:numPr>
-          <w:ilvl w:val="0"/>
-          <w:numId w:val="1"/>
-        </w:numPr>
-      </w:pPr>
-      <w:r>
-        <w:t>Challenge and manage variation to achieve safety and production targets and challenge KPIs</w:t>
-      </w:r>
-    </w:p>
-    <w:p>
-      <w:pPr>
-        <w:numPr>
-          <w:ilvl w:val="0"/>
-          <w:numId w:val="1"/>
-        </w:numPr>
-      </w:pPr>
-      <w:r>
-        <w:t>Maintain high levels of pride in the workplace including particular focus on housekeeping standards</w:t>
+        <w:t>leadership</w:t>
+      </w:r>
+      <w:r>
+        <w:t> capabilities that will allow you to liaise with stakeholders at all levels of our business;</w:t>
+      </w:r>
+    </w:p>
+    <w:p>
+      <w:pPr>
+        <w:numPr>
+          <w:ilvl w:val="0"/>
+          <w:numId w:val="2"/>
+        </w:numPr>
+      </w:pPr>
+      <w:r>
+        <w:t>Have an extremely high drive to learn and grow your skills to be the best version of yourself;</w:t>
+      </w:r>
+    </w:p>
+    <w:p>
+      <w:pPr>
+        <w:numPr>
+          <w:ilvl w:val="0"/>
+          <w:numId w:val="2"/>
+        </w:numPr>
+      </w:pPr>
+      <w:r>
+        <w:t>Obtain an understanding of a SHMS;</w:t>
+      </w:r>
+    </w:p>
+    <w:p>
+      <w:pPr>
+        <w:numPr>
+          <w:ilvl w:val="0"/>
+          <w:numId w:val="2"/>
+        </w:numPr>
+      </w:pPr>
+      <w:r>
+        <w:t>Strong interpersonal and negotiation skills that will allow you to positively influence our culture at Rolleston;</w:t>
+      </w:r>
+    </w:p>
+    <w:p>
+      <w:pPr>
+        <w:numPr>
+          <w:ilvl w:val="0"/>
+          <w:numId w:val="2"/>
+        </w:numPr>
+      </w:pPr>
+      <w:r>
+        <w:t>Ability to maintain a high level of positive safety performance and workplace culture through teamwork, personal commitment, and application of the company values;</w:t>
+      </w:r>
+    </w:p>
+    <w:p>
+      <w:pPr>
+        <w:numPr>
+          <w:ilvl w:val="0"/>
+          <w:numId w:val="2"/>
+        </w:numPr>
+      </w:pPr>
+      <w:r>
+        <w:t>Highly developed interpersonal, communication and leadership skills;</w:t>
+      </w:r>
+    </w:p>
+    <w:p>
+      <w:pPr>
+        <w:numPr>
+          <w:ilvl w:val="0"/>
+          <w:numId w:val="2"/>
+        </w:numPr>
+      </w:pPr>
+      <w:r>
+        <w:t>Be open to change crews.</w:t>
       </w:r>
     </w:p>
     <w:p>
@@ -271,94 +360,236 @@
           <w:b/>
           <w:bCs/>
         </w:rPr>
-        <w:t>The successful applicant will have:</w:t>
-      </w:r>
-    </w:p>
-    <w:p>
-      <w:pPr>
-        <w:numPr>
-          <w:ilvl w:val="0"/>
-          <w:numId w:val="2"/>
-        </w:numPr>
-      </w:pPr>
-      <w:r>
-        <w:t>Have a sound knowledge of Smelting (</w:t>
-      </w:r>
-      <w:proofErr w:type="spellStart"/>
-      <w:r>
-        <w:t>IsaSmelt</w:t>
-      </w:r>
-      <w:proofErr w:type="spellEnd"/>
-      <w:r>
-        <w:t xml:space="preserve"> knowledge would be advantageous)</w:t>
-      </w:r>
-    </w:p>
-    <w:p>
-      <w:pPr>
-        <w:numPr>
-          <w:ilvl w:val="0"/>
-          <w:numId w:val="2"/>
-        </w:numPr>
-      </w:pPr>
-      <w:r>
-        <w:t>Previous experience with supervising and leading teams</w:t>
-      </w:r>
-    </w:p>
-    <w:p>
-      <w:pPr>
-        <w:numPr>
-          <w:ilvl w:val="0"/>
-          <w:numId w:val="2"/>
-        </w:numPr>
-      </w:pPr>
-      <w:r>
-        <w:t>The ability to lead by example and have a strong work ethic</w:t>
-      </w:r>
-    </w:p>
-    <w:p>
-      <w:pPr>
-        <w:numPr>
-          <w:ilvl w:val="0"/>
-          <w:numId w:val="2"/>
-        </w:numPr>
-      </w:pPr>
-      <w:r>
-        <w:t>Have safety as a core value and the ability to hold others accountable to it</w:t>
-      </w:r>
-    </w:p>
-    <w:p>
-      <w:pPr>
-        <w:numPr>
-          <w:ilvl w:val="0"/>
-          <w:numId w:val="2"/>
-        </w:numPr>
-      </w:pPr>
-      <w:r>
-        <w:t>A minimum of 4 years working in the Smelting and Mining industry</w:t>
-      </w:r>
-    </w:p>
-    <w:p>
-      <w:pPr>
-        <w:numPr>
-          <w:ilvl w:val="0"/>
-          <w:numId w:val="2"/>
-        </w:numPr>
-      </w:pPr>
-      <w:r>
-        <w:t>Technical knowledge and organisational skills will ensure you thrive in this fantastic opportunity for career progression</w:t>
-      </w:r>
-    </w:p>
-    <w:p>
+        <w:t>About Rolleston Open Cut</w:t>
+      </w:r>
+    </w:p>
+    <w:p>
+      <w:r>
+        <w:t>We have worked hard to foster a culture that is guided by our People Values, to ensure our employees feel they </w:t>
+      </w:r>
       <w:r>
         <w:rPr>
           <w:b/>
           <w:bCs/>
         </w:rPr>
-        <w:t>For further information, please contact:</w:t>
-      </w:r>
-      <w:r>
-        <w:br/>
-        <w:t>Braedan Faifai on M:</w:t>
+        <w:t>belong</w:t>
+      </w:r>
+      <w:r>
+        <w:t>, are </w:t>
+      </w:r>
+      <w:r>
+        <w:rPr>
+          <w:b/>
+          <w:bCs/>
+        </w:rPr>
+        <w:t>recognised</w:t>
+      </w:r>
+      <w:r>
+        <w:t>, feel </w:t>
+      </w:r>
+      <w:r>
+        <w:rPr>
+          <w:b/>
+          <w:bCs/>
+        </w:rPr>
+        <w:t>valued</w:t>
+      </w:r>
+      <w:r>
+        <w:t> and </w:t>
+      </w:r>
+      <w:r>
+        <w:rPr>
+          <w:b/>
+          <w:bCs/>
+        </w:rPr>
+        <w:t>rewarded</w:t>
+      </w:r>
+      <w:r>
+        <w:t>.</w:t>
+      </w:r>
+    </w:p>
+    <w:p>
+      <w:r>
+        <w:t>Here are just some of the benefits we offer:</w:t>
+      </w:r>
+    </w:p>
+    <w:p>
+      <w:pPr>
+        <w:numPr>
+          <w:ilvl w:val="0"/>
+          <w:numId w:val="3"/>
+        </w:numPr>
+      </w:pPr>
+      <w:r>
+        <w:t>Work life balance with 8/6 Day Shift work 12.5-hour shifts.</w:t>
+      </w:r>
+    </w:p>
+    <w:p>
+      <w:pPr>
+        <w:numPr>
+          <w:ilvl w:val="0"/>
+          <w:numId w:val="3"/>
+        </w:numPr>
+      </w:pPr>
+      <w:r>
+        <w:t>Highly competitive remuneration package</w:t>
+      </w:r>
+    </w:p>
+    <w:p>
+      <w:pPr>
+        <w:numPr>
+          <w:ilvl w:val="0"/>
+          <w:numId w:val="3"/>
+        </w:numPr>
+      </w:pPr>
+      <w:r>
+        <w:t>Annual short term performance bonus (Staff only)</w:t>
+      </w:r>
+    </w:p>
+    <w:p>
+      <w:pPr>
+        <w:numPr>
+          <w:ilvl w:val="0"/>
+          <w:numId w:val="3"/>
+        </w:numPr>
+      </w:pPr>
+      <w:r>
+        <w:t>BIBO options from Yeppoon, Rockhampton, Bundaberg, Gladstone</w:t>
+      </w:r>
+    </w:p>
+    <w:p>
+      <w:pPr>
+        <w:numPr>
+          <w:ilvl w:val="0"/>
+          <w:numId w:val="3"/>
+        </w:numPr>
+      </w:pPr>
+      <w:r>
+        <w:t>Above award Annual Leave entitlement</w:t>
+      </w:r>
+    </w:p>
+    <w:p>
+      <w:pPr>
+        <w:numPr>
+          <w:ilvl w:val="0"/>
+          <w:numId w:val="3"/>
+        </w:numPr>
+      </w:pPr>
+      <w:r>
+        <w:t>Permanent camp rooms in the village based on the mining lease</w:t>
+      </w:r>
+    </w:p>
+    <w:p>
+      <w:pPr>
+        <w:numPr>
+          <w:ilvl w:val="0"/>
+          <w:numId w:val="3"/>
+        </w:numPr>
+      </w:pPr>
+      <w:r>
+        <w:t>Gym, pool, and tennis court facilities at a family friendly village</w:t>
+      </w:r>
+    </w:p>
+    <w:p>
+      <w:pPr>
+        <w:numPr>
+          <w:ilvl w:val="0"/>
+          <w:numId w:val="3"/>
+        </w:numPr>
+      </w:pPr>
+      <w:r>
+        <w:t>Inclusive culture that promotes real change</w:t>
+      </w:r>
+    </w:p>
+    <w:p>
+      <w:pPr>
+        <w:numPr>
+          <w:ilvl w:val="0"/>
+          <w:numId w:val="3"/>
+        </w:numPr>
+      </w:pPr>
+      <w:r>
+        <w:t>Passionate and dedicated leadership team</w:t>
+      </w:r>
+    </w:p>
+    <w:p>
+      <w:pPr>
+        <w:numPr>
+          <w:ilvl w:val="0"/>
+          <w:numId w:val="3"/>
+        </w:numPr>
+      </w:pPr>
+      <w:r>
+        <w:t>Professional training and development opportunities, including upskilling, and education assistance for all positions</w:t>
+      </w:r>
+    </w:p>
+    <w:p>
+      <w:pPr>
+        <w:numPr>
+          <w:ilvl w:val="0"/>
+          <w:numId w:val="3"/>
+        </w:numPr>
+      </w:pPr>
+      <w:r>
+        <w:t>Generous annual private health insurance benefit</w:t>
+      </w:r>
+    </w:p>
+    <w:p>
+      <w:pPr>
+        <w:numPr>
+          <w:ilvl w:val="0"/>
+          <w:numId w:val="3"/>
+        </w:numPr>
+      </w:pPr>
+      <w:r>
+        <w:t>Fit for Life Program offers exclusive discounts and access to a range of educational tools to build the skills to help you remain fit for life.</w:t>
+      </w:r>
+    </w:p>
+    <w:p>
+      <w:pPr>
+        <w:numPr>
+          <w:ilvl w:val="0"/>
+          <w:numId w:val="3"/>
+        </w:numPr>
+      </w:pPr>
+      <w:r>
+        <w:t>AVIS hire vehicle discount</w:t>
+      </w:r>
+    </w:p>
+    <w:p>
+      <w:pPr>
+        <w:numPr>
+          <w:ilvl w:val="0"/>
+          <w:numId w:val="3"/>
+        </w:numPr>
+      </w:pPr>
+      <w:r>
+        <w:t>The ability to salary sacrifice flights, super and novated leasing</w:t>
+      </w:r>
+    </w:p>
+    <w:p>
+      <w:pPr>
+        <w:numPr>
+          <w:ilvl w:val="0"/>
+          <w:numId w:val="3"/>
+        </w:numPr>
+      </w:pPr>
+      <w:r>
+        <w:t>Employee Assistance Program through Converge International</w:t>
+      </w:r>
+    </w:p>
+    <w:p>
+      <w:r>
+        <w:rPr>
+          <w:b/>
+          <w:bCs/>
+        </w:rPr>
+        <w:t>Apply now at glencore.com/careers</w:t>
+      </w:r>
+    </w:p>
+    <w:p>
+      <w:r>
+        <w:t>For further information please contact </w:t>
       </w:r>
       <w:hyperlink r:id="rId10" w:history="1">
         <w:r>
@@ -367,9 +598,28 @@
             <w:b/>
             <w:bCs/>
           </w:rPr>
-          <w:t>0448 646 001</w:t>
+          <w:t>RollestonHR@glencore.com.au</w:t>
         </w:r>
       </w:hyperlink>
+    </w:p>
+    <w:p>
+      <w:r>
+        <w:rPr>
+          <w:b/>
+          <w:bCs/>
+        </w:rPr>
+        <w:t>Application close 14 days from the date advertised.</w:t>
+      </w:r>
+    </w:p>
+    <w:p>
+      <w:r>
+        <w:t>All internal applicants should discuss their interest in this position with their Manager prior to submitting an application.</w:t>
+      </w:r>
+    </w:p>
+    <w:p>
+      <w:r>
+        <w:t>If you value achievement, career progression, a challenge and are keen to continue to develop and learn, we welcome your application.</w:t>
+      </w:r>
     </w:p>
     <w:p/>
     <w:sectPr>
@@ -385,9 +635,9 @@
 <file path=word/numbering.xml><?xml version="1.0" encoding="utf-8"?>
 <w:numbering xmlns:wpc="http://schemas.microsoft.com/office/word/2010/wordprocessingCanvas" xmlns:cx="http://schemas.microsoft.com/office/drawing/2014/chartex" xmlns:cx1="http://schemas.microsoft.com/office/drawing/2015/9/8/chartex" xmlns:cx2="http://schemas.microsoft.com/office/drawing/2015/10/21/chartex" xmlns:cx3="http://schemas.microsoft.com/office/drawing/2016/5/9/chartex" xmlns:cx4="http://schemas.microsoft.com/office/drawing/2016/5/10/chartex" xmlns:cx5="http://schemas.microsoft.com/office/drawing/2016/5/11/chartex" xmlns:cx6="http://schemas.microsoft.com/office/drawing/2016/5/12/chartex" xmlns:cx7="http://schemas.microsoft.com/office/drawing/2016/5/13/chartex" xmlns:cx8="http://schemas.microsoft.com/office/drawing/2016/5/14/chartex" xmlns:mc="http://schemas.openxmlformats.org/markup-compatibility/2006" xmlns:aink="http://schemas.microsoft.com/office/drawing/2016/ink" xmlns:am3d="http://schemas.microsoft.com/office/drawing/2017/model3d" xmlns:o="urn:schemas-microsoft-com:office:office" xmlns:oel="http://schemas.microsoft.com/office/2019/extlst" xmlns:r="http://schemas.openxmlformats.org/officeDocument/2006/relationships" xmlns:m="http://schemas.openxmlformats.org/officeDocument/2006/math" xmlns:v="urn:schemas-microsoft-com:vml" xmlns:wp14="http://schemas.microsoft.com/office/word/2010/wordprocessingDrawing" xmlns:wp="http://schemas.openxmlformats.org/drawingml/2006/wordprocessingDrawing" xmlns:w10="urn:schemas-microsoft-com:office:word" xmlns:w="http://schemas.openxmlformats.org/wordprocessingml/2006/main" xmlns:w14="http://schemas.microsoft.com/office/word/2010/wordml" xmlns:w15="http://schemas.microsoft.com/office/word/2012/wordml" xmlns:w16cex="http://schemas.microsoft.com/office/word/2018/wordml/cex" xmlns:w16cid="http://schemas.microsoft.com/office/word/2016/wordml/cid" xmlns:w16="http://schemas.microsoft.com/office/word/2018/wordml" xmlns:w16du="http://schemas.microsoft.com/office/word/2023/wordml/word16du" xmlns:w16sdtdh="http://schemas.microsoft.com/office/word/2020/wordml/sdtdatahash" xmlns:w16sdtfl="http://schemas.microsoft.com/office/word/2024/wordml/sdtformatlock" xmlns:w16se="http://schemas.microsoft.com/office/word/2015/wordml/symex" xmlns:wpg="http://schemas.microsoft.com/office/word/2010/wordprocessingGroup" xmlns:wpi="http://schemas.microsoft.com/office/word/2010/wordprocessingInk" xmlns:wne="http://schemas.microsoft.com/office/word/2006/wordml" xmlns:wps="http://schemas.microsoft.com/office/word/2010/wordprocessingShape" mc:Ignorable="w14 w15 w16se w16cid w16 w16cex w16sdtdh w16sdtfl w16du wp14">
   <w:abstractNum w:abstractNumId="0" w15:restartNumberingAfterBreak="0">
-    <w:nsid w:val="1BAB32F3"/>
+    <w:nsid w:val="20EA703B"/>
     <w:multiLevelType w:val="multilevel"/>
-    <w:tmpl w:val="821A9106"/>
+    <w:tmpl w:val="D3F4C83C"/>
     <w:lvl w:ilvl="0">
       <w:start w:val="1"/>
       <w:numFmt w:val="bullet"/>
@@ -534,9 +784,9 @@
     </w:lvl>
   </w:abstractNum>
   <w:abstractNum w:abstractNumId="1" w15:restartNumberingAfterBreak="0">
-    <w:nsid w:val="7D4819C1"/>
+    <w:nsid w:val="38DA4DA4"/>
     <w:multiLevelType w:val="multilevel"/>
-    <w:tmpl w:val="5AA85F40"/>
+    <w:tmpl w:val="B9209518"/>
     <w:lvl w:ilvl="0">
       <w:start w:val="1"/>
       <w:numFmt w:val="bullet"/>
@@ -682,10 +932,162 @@
       </w:rPr>
     </w:lvl>
   </w:abstractNum>
-  <w:num w:numId="1" w16cid:durableId="302975139">
+  <w:abstractNum w:abstractNumId="2" w15:restartNumberingAfterBreak="0">
+    <w:nsid w:val="77EA2534"/>
+    <w:multiLevelType w:val="multilevel"/>
+    <w:tmpl w:val="CD700166"/>
+    <w:lvl w:ilvl="0">
+      <w:start w:val="1"/>
+      <w:numFmt w:val="bullet"/>
+      <w:lvlText w:val=""/>
+      <w:lvlJc w:val="left"/>
+      <w:pPr>
+        <w:tabs>
+          <w:tab w:val="num" w:pos="720"/>
+        </w:tabs>
+        <w:ind w:left="720" w:hanging="360"/>
+      </w:pPr>
+      <w:rPr>
+        <w:rFonts w:ascii="Symbol" w:hAnsi="Symbol" w:hint="default"/>
+        <w:sz w:val="20"/>
+      </w:rPr>
+    </w:lvl>
+    <w:lvl w:ilvl="1" w:tentative="1">
+      <w:start w:val="1"/>
+      <w:numFmt w:val="bullet"/>
+      <w:lvlText w:val="o"/>
+      <w:lvlJc w:val="left"/>
+      <w:pPr>
+        <w:tabs>
+          <w:tab w:val="num" w:pos="1440"/>
+        </w:tabs>
+        <w:ind w:left="1440" w:hanging="360"/>
+      </w:pPr>
+      <w:rPr>
+        <w:rFonts w:ascii="Courier New" w:hAnsi="Courier New" w:hint="default"/>
+        <w:sz w:val="20"/>
+      </w:rPr>
+    </w:lvl>
+    <w:lvl w:ilvl="2" w:tentative="1">
+      <w:start w:val="1"/>
+      <w:numFmt w:val="bullet"/>
+      <w:lvlText w:val=""/>
+      <w:lvlJc w:val="left"/>
+      <w:pPr>
+        <w:tabs>
+          <w:tab w:val="num" w:pos="2160"/>
+        </w:tabs>
+        <w:ind w:left="2160" w:hanging="360"/>
+      </w:pPr>
+      <w:rPr>
+        <w:rFonts w:ascii="Wingdings" w:hAnsi="Wingdings" w:hint="default"/>
+        <w:sz w:val="20"/>
+      </w:rPr>
+    </w:lvl>
+    <w:lvl w:ilvl="3" w:tentative="1">
+      <w:start w:val="1"/>
+      <w:numFmt w:val="bullet"/>
+      <w:lvlText w:val=""/>
+      <w:lvlJc w:val="left"/>
+      <w:pPr>
+        <w:tabs>
+          <w:tab w:val="num" w:pos="2880"/>
+        </w:tabs>
+        <w:ind w:left="2880" w:hanging="360"/>
+      </w:pPr>
+      <w:rPr>
+        <w:rFonts w:ascii="Wingdings" w:hAnsi="Wingdings" w:hint="default"/>
+        <w:sz w:val="20"/>
+      </w:rPr>
+    </w:lvl>
+    <w:lvl w:ilvl="4" w:tentative="1">
+      <w:start w:val="1"/>
+      <w:numFmt w:val="bullet"/>
+      <w:lvlText w:val=""/>
+      <w:lvlJc w:val="left"/>
+      <w:pPr>
+        <w:tabs>
+          <w:tab w:val="num" w:pos="3600"/>
+        </w:tabs>
+        <w:ind w:left="3600" w:hanging="360"/>
+      </w:pPr>
+      <w:rPr>
+        <w:rFonts w:ascii="Wingdings" w:hAnsi="Wingdings" w:hint="default"/>
+        <w:sz w:val="20"/>
+      </w:rPr>
+    </w:lvl>
+    <w:lvl w:ilvl="5" w:tentative="1">
+      <w:start w:val="1"/>
+      <w:numFmt w:val="bullet"/>
+      <w:lvlText w:val=""/>
+      <w:lvlJc w:val="left"/>
+      <w:pPr>
+        <w:tabs>
+          <w:tab w:val="num" w:pos="4320"/>
+        </w:tabs>
+        <w:ind w:left="4320" w:hanging="360"/>
+      </w:pPr>
+      <w:rPr>
+        <w:rFonts w:ascii="Wingdings" w:hAnsi="Wingdings" w:hint="default"/>
+        <w:sz w:val="20"/>
+      </w:rPr>
+    </w:lvl>
+    <w:lvl w:ilvl="6" w:tentative="1">
+      <w:start w:val="1"/>
+      <w:numFmt w:val="bullet"/>
+      <w:lvlText w:val=""/>
+      <w:lvlJc w:val="left"/>
+      <w:pPr>
+        <w:tabs>
+          <w:tab w:val="num" w:pos="5040"/>
+        </w:tabs>
+        <w:ind w:left="5040" w:hanging="360"/>
+      </w:pPr>
+      <w:rPr>
+        <w:rFonts w:ascii="Wingdings" w:hAnsi="Wingdings" w:hint="default"/>
+        <w:sz w:val="20"/>
+      </w:rPr>
+    </w:lvl>
+    <w:lvl w:ilvl="7" w:tentative="1">
+      <w:start w:val="1"/>
+      <w:numFmt w:val="bullet"/>
+      <w:lvlText w:val=""/>
+      <w:lvlJc w:val="left"/>
+      <w:pPr>
+        <w:tabs>
+          <w:tab w:val="num" w:pos="5760"/>
+        </w:tabs>
+        <w:ind w:left="5760" w:hanging="360"/>
+      </w:pPr>
+      <w:rPr>
+        <w:rFonts w:ascii="Wingdings" w:hAnsi="Wingdings" w:hint="default"/>
+        <w:sz w:val="20"/>
+      </w:rPr>
+    </w:lvl>
+    <w:lvl w:ilvl="8" w:tentative="1">
+      <w:start w:val="1"/>
+      <w:numFmt w:val="bullet"/>
+      <w:lvlText w:val=""/>
+      <w:lvlJc w:val="left"/>
+      <w:pPr>
+        <w:tabs>
+          <w:tab w:val="num" w:pos="6480"/>
+        </w:tabs>
+        <w:ind w:left="6480" w:hanging="360"/>
+      </w:pPr>
+      <w:rPr>
+        <w:rFonts w:ascii="Wingdings" w:hAnsi="Wingdings" w:hint="default"/>
+        <w:sz w:val="20"/>
+      </w:rPr>
+    </w:lvl>
+  </w:abstractNum>
+  <w:num w:numId="1" w16cid:durableId="3175045">
+    <w:abstractNumId w:val="2"/>
+  </w:num>
+  <w:num w:numId="2" w16cid:durableId="685907510">
     <w:abstractNumId w:val="0"/>
   </w:num>
-  <w:num w:numId="2" w16cid:durableId="1267423706">
+  <w:num w:numId="3" w16cid:durableId="284193559">
     <w:abstractNumId w:val="1"/>
   </w:num>
 </w:numbering>
@@ -1099,7 +1501,7 @@
     <w:link w:val="Heading1Char"/>
     <w:uiPriority w:val="9"/>
     <w:qFormat/>
-    <w:rsid w:val="002A1DD1"/>
+    <w:rsid w:val="00AD61F1"/>
     <w:pPr>
       <w:keepNext/>
       <w:keepLines/>
@@ -1122,7 +1524,7 @@
     <w:semiHidden/>
     <w:unhideWhenUsed/>
     <w:qFormat/>
-    <w:rsid w:val="002A1DD1"/>
+    <w:rsid w:val="00AD61F1"/>
     <w:pPr>
       <w:keepNext/>
       <w:keepLines/>
@@ -1145,7 +1547,7 @@
     <w:semiHidden/>
     <w:unhideWhenUsed/>
     <w:qFormat/>
-    <w:rsid w:val="002A1DD1"/>
+    <w:rsid w:val="00AD61F1"/>
     <w:pPr>
       <w:keepNext/>
       <w:keepLines/>
@@ -1168,7 +1570,7 @@
     <w:semiHidden/>
     <w:unhideWhenUsed/>
     <w:qFormat/>
-    <w:rsid w:val="002A1DD1"/>
+    <w:rsid w:val="00AD61F1"/>
     <w:pPr>
       <w:keepNext/>
       <w:keepLines/>
@@ -1191,7 +1593,7 @@
     <w:semiHidden/>
     <w:unhideWhenUsed/>
     <w:qFormat/>
-    <w:rsid w:val="002A1DD1"/>
+    <w:rsid w:val="00AD61F1"/>
     <w:pPr>
       <w:keepNext/>
       <w:keepLines/>
@@ -1212,7 +1614,7 @@
     <w:semiHidden/>
     <w:unhideWhenUsed/>
     <w:qFormat/>
-    <w:rsid w:val="002A1DD1"/>
+    <w:rsid w:val="00AD61F1"/>
     <w:pPr>
       <w:keepNext/>
       <w:keepLines/>
@@ -1235,7 +1637,7 @@
     <w:semiHidden/>
     <w:unhideWhenUsed/>
     <w:qFormat/>
-    <w:rsid w:val="002A1DD1"/>
+    <w:rsid w:val="00AD61F1"/>
     <w:pPr>
       <w:keepNext/>
       <w:keepLines/>
@@ -1256,7 +1658,7 @@
     <w:semiHidden/>
     <w:unhideWhenUsed/>
     <w:qFormat/>
-    <w:rsid w:val="002A1DD1"/>
+    <w:rsid w:val="00AD61F1"/>
     <w:pPr>
       <w:keepNext/>
       <w:keepLines/>
@@ -1279,7 +1681,7 @@
     <w:semiHidden/>
     <w:unhideWhenUsed/>
     <w:qFormat/>
-    <w:rsid w:val="002A1DD1"/>
+    <w:rsid w:val="00AD61F1"/>
     <w:pPr>
       <w:keepNext/>
       <w:keepLines/>
@@ -1322,7 +1724,7 @@
     <w:basedOn w:val="DefaultParagraphFont"/>
     <w:link w:val="Heading1"/>
     <w:uiPriority w:val="9"/>
-    <w:rsid w:val="002A1DD1"/>
+    <w:rsid w:val="00AD61F1"/>
     <w:rPr>
       <w:rFonts w:asciiTheme="majorHAnsi" w:eastAsiaTheme="majorEastAsia" w:hAnsiTheme="majorHAnsi" w:cstheme="majorBidi"/>
       <w:color w:val="0F4761" w:themeColor="accent1" w:themeShade="BF"/>
@@ -1336,7 +1738,7 @@
     <w:link w:val="Heading2"/>
     <w:uiPriority w:val="9"/>
     <w:semiHidden/>
-    <w:rsid w:val="002A1DD1"/>
+    <w:rsid w:val="00AD61F1"/>
     <w:rPr>
       <w:rFonts w:asciiTheme="majorHAnsi" w:eastAsiaTheme="majorEastAsia" w:hAnsiTheme="majorHAnsi" w:cstheme="majorBidi"/>
       <w:color w:val="0F4761" w:themeColor="accent1" w:themeShade="BF"/>
@@ -1350,7 +1752,7 @@
     <w:link w:val="Heading3"/>
     <w:uiPriority w:val="9"/>
     <w:semiHidden/>
-    <w:rsid w:val="002A1DD1"/>
+    <w:rsid w:val="00AD61F1"/>
     <w:rPr>
       <w:rFonts w:eastAsiaTheme="majorEastAsia" w:cstheme="majorBidi"/>
       <w:color w:val="0F4761" w:themeColor="accent1" w:themeShade="BF"/>
@@ -1364,7 +1766,7 @@
     <w:link w:val="Heading4"/>
     <w:uiPriority w:val="9"/>
     <w:semiHidden/>
-    <w:rsid w:val="002A1DD1"/>
+    <w:rsid w:val="00AD61F1"/>
     <w:rPr>
       <w:rFonts w:eastAsiaTheme="majorEastAsia" w:cstheme="majorBidi"/>
       <w:i/>
@@ -1378,7 +1780,7 @@
     <w:link w:val="Heading5"/>
     <w:uiPriority w:val="9"/>
     <w:semiHidden/>
-    <w:rsid w:val="002A1DD1"/>
+    <w:rsid w:val="00AD61F1"/>
     <w:rPr>
       <w:rFonts w:eastAsiaTheme="majorEastAsia" w:cstheme="majorBidi"/>
       <w:color w:val="0F4761" w:themeColor="accent1" w:themeShade="BF"/>
@@ -1390,7 +1792,7 @@
     <w:link w:val="Heading6"/>
     <w:uiPriority w:val="9"/>
     <w:semiHidden/>
-    <w:rsid w:val="002A1DD1"/>
+    <w:rsid w:val="00AD61F1"/>
     <w:rPr>
       <w:rFonts w:eastAsiaTheme="majorEastAsia" w:cstheme="majorBidi"/>
       <w:i/>
@@ -1404,7 +1806,7 @@
     <w:link w:val="Heading7"/>
     <w:uiPriority w:val="9"/>
     <w:semiHidden/>
-    <w:rsid w:val="002A1DD1"/>
+    <w:rsid w:val="00AD61F1"/>
     <w:rPr>
       <w:rFonts w:eastAsiaTheme="majorEastAsia" w:cstheme="majorBidi"/>
       <w:color w:val="595959" w:themeColor="text1" w:themeTint="A6"/>
@@ -1416,7 +1818,7 @@
     <w:link w:val="Heading8"/>
     <w:uiPriority w:val="9"/>
     <w:semiHidden/>
-    <w:rsid w:val="002A1DD1"/>
+    <w:rsid w:val="00AD61F1"/>
     <w:rPr>
       <w:rFonts w:eastAsiaTheme="majorEastAsia" w:cstheme="majorBidi"/>
       <w:i/>
@@ -1430,7 +1832,7 @@
     <w:link w:val="Heading9"/>
     <w:uiPriority w:val="9"/>
     <w:semiHidden/>
-    <w:rsid w:val="002A1DD1"/>
+    <w:rsid w:val="00AD61F1"/>
     <w:rPr>
       <w:rFonts w:eastAsiaTheme="majorEastAsia" w:cstheme="majorBidi"/>
       <w:color w:val="272727" w:themeColor="text1" w:themeTint="D8"/>
@@ -1443,7 +1845,7 @@
     <w:link w:val="TitleChar"/>
     <w:uiPriority w:val="10"/>
     <w:qFormat/>
-    <w:rsid w:val="002A1DD1"/>
+    <w:rsid w:val="00AD61F1"/>
     <w:pPr>
       <w:spacing w:after="80" w:line="240" w:lineRule="auto"/>
       <w:contextualSpacing/>
@@ -1461,7 +1863,7 @@
     <w:basedOn w:val="DefaultParagraphFont"/>
     <w:link w:val="Title"/>
     <w:uiPriority w:val="10"/>
-    <w:rsid w:val="002A1DD1"/>
+    <w:rsid w:val="00AD61F1"/>
     <w:rPr>
       <w:rFonts w:asciiTheme="majorHAnsi" w:eastAsiaTheme="majorEastAsia" w:hAnsiTheme="majorHAnsi" w:cstheme="majorBidi"/>
       <w:spacing w:val="-10"/>
@@ -1477,7 +1879,7 @@
     <w:link w:val="SubtitleChar"/>
     <w:uiPriority w:val="11"/>
     <w:qFormat/>
-    <w:rsid w:val="002A1DD1"/>
+    <w:rsid w:val="00AD61F1"/>
     <w:pPr>
       <w:numPr>
         <w:ilvl w:val="1"/>
@@ -1496,7 +1898,7 @@
     <w:basedOn w:val="DefaultParagraphFont"/>
     <w:link w:val="Subtitle"/>
     <w:uiPriority w:val="11"/>
-    <w:rsid w:val="002A1DD1"/>
+    <w:rsid w:val="00AD61F1"/>
     <w:rPr>
       <w:rFonts w:eastAsiaTheme="majorEastAsia" w:cstheme="majorBidi"/>
       <w:color w:val="595959" w:themeColor="text1" w:themeTint="A6"/>
@@ -1512,7 +1914,7 @@
     <w:link w:val="QuoteChar"/>
     <w:uiPriority w:val="29"/>
     <w:qFormat/>
-    <w:rsid w:val="002A1DD1"/>
+    <w:rsid w:val="00AD61F1"/>
     <w:pPr>
       <w:spacing w:before="160"/>
       <w:jc w:val="center"/>
@@ -1528,7 +1930,7 @@
     <w:basedOn w:val="DefaultParagraphFont"/>
     <w:link w:val="Quote"/>
     <w:uiPriority w:val="29"/>
-    <w:rsid w:val="002A1DD1"/>
+    <w:rsid w:val="00AD61F1"/>
     <w:rPr>
       <w:i/>
       <w:iCs/>
@@ -1540,7 +1942,7 @@
     <w:basedOn w:val="Normal"/>
     <w:uiPriority w:val="34"/>
     <w:qFormat/>
-    <w:rsid w:val="002A1DD1"/>
+    <w:rsid w:val="00AD61F1"/>
     <w:pPr>
       <w:ind w:left="720"/>
       <w:contextualSpacing/>
@@ -1551,7 +1953,7 @@
     <w:basedOn w:val="DefaultParagraphFont"/>
     <w:uiPriority w:val="21"/>
     <w:qFormat/>
-    <w:rsid w:val="002A1DD1"/>
+    <w:rsid w:val="00AD61F1"/>
     <w:rPr>
       <w:i/>
       <w:iCs/>
@@ -1565,7 +1967,7 @@
     <w:link w:val="IntenseQuoteChar"/>
     <w:uiPriority w:val="30"/>
     <w:qFormat/>
-    <w:rsid w:val="002A1DD1"/>
+    <w:rsid w:val="00AD61F1"/>
     <w:pPr>
       <w:pBdr>
         <w:top w:val="single" w:sz="4" w:space="10" w:color="0F4761" w:themeColor="accent1" w:themeShade="BF"/>
@@ -1586,7 +1988,7 @@
     <w:basedOn w:val="DefaultParagraphFont"/>
     <w:link w:val="IntenseQuote"/>
     <w:uiPriority w:val="30"/>
-    <w:rsid w:val="002A1DD1"/>
+    <w:rsid w:val="00AD61F1"/>
     <w:rPr>
       <w:i/>
       <w:iCs/>
@@ -1598,7 +2000,7 @@
     <w:basedOn w:val="DefaultParagraphFont"/>
     <w:uiPriority w:val="32"/>
     <w:qFormat/>
-    <w:rsid w:val="002A1DD1"/>
+    <w:rsid w:val="00AD61F1"/>
     <w:rPr>
       <w:b/>
       <w:bCs/>
@@ -1612,7 +2014,7 @@
     <w:basedOn w:val="DefaultParagraphFont"/>
     <w:uiPriority w:val="99"/>
     <w:unhideWhenUsed/>
-    <w:rsid w:val="00A13A9E"/>
+    <w:rsid w:val="00383B23"/>
     <w:rPr>
       <w:color w:val="467886" w:themeColor="hyperlink"/>
       <w:u w:val="single"/>
@@ -1624,7 +2026,7 @@
     <w:uiPriority w:val="99"/>
     <w:semiHidden/>
     <w:unhideWhenUsed/>
-    <w:rsid w:val="00A13A9E"/>
+    <w:rsid w:val="00383B23"/>
     <w:rPr>
       <w:color w:val="605E5C"/>
       <w:shd w:val="clear" w:color="auto" w:fill="E1DFDD"/>
@@ -2102,13 +2504,13 @@
 </file>
 
 <file path=customXml/itemProps1.xml><?xml version="1.0" encoding="utf-8"?>
-<ds:datastoreItem xmlns:ds="http://schemas.openxmlformats.org/officeDocument/2006/customXml" ds:itemID="{C9EA7779-4AB1-4975-BAA6-424D02E16356}"/>
+<ds:datastoreItem xmlns:ds="http://schemas.openxmlformats.org/officeDocument/2006/customXml" ds:itemID="{B3C131A6-93BD-4E51-AC1A-EE092958C135}"/>
 </file>
 
 <file path=customXml/itemProps2.xml><?xml version="1.0" encoding="utf-8"?>
-<ds:datastoreItem xmlns:ds="http://schemas.openxmlformats.org/officeDocument/2006/customXml" ds:itemID="{04131B10-8357-49C3-BC90-FDCDF57A6D80}"/>
+<ds:datastoreItem xmlns:ds="http://schemas.openxmlformats.org/officeDocument/2006/customXml" ds:itemID="{375C86C3-9399-4693-9028-4AF6295C5315}"/>
 </file>
 
 <file path=customXml/itemProps3.xml><?xml version="1.0" encoding="utf-8"?>
-<ds:datastoreItem xmlns:ds="http://schemas.openxmlformats.org/officeDocument/2006/customXml" ds:itemID="{CC3D0207-9F1E-474A-99CD-B52C15C2E1B8}"/>
+<ds:datastoreItem xmlns:ds="http://schemas.openxmlformats.org/officeDocument/2006/customXml" ds:itemID="{97B5311C-E6C0-4517-B444-B5769E26F7A5}"/>
 </file>
</xml_diff>